<commit_message>
Episodes 2-10 TTS pacing pass: scene-break spacing replaces empty paragraphs, ~50 dashes rewritten, tone cues on all bare dialogue, system lines sentence-cased with ledger-voice heralds (per Section 3.10)
Co-Authored-By: Claude Fable 5 <noreply@anthropic.com>
</commit_message>
<xml_diff>
--- a/episodes/The_Dark_Rise_Episode_02.docx
+++ b/episodes/The_Dark_Rise_Episode_02.docx
@@ -112,20 +112,7 @@
     </ns0:p>
     <ns0:p>
       <ns0:pPr>
-        <ns0:spacing ns0:after="0" ns0:line="360"/>
-      </ns0:pPr>
-      <ns0:r>
-        <ns0:rPr>
-          <ns0:rFonts ns0:ascii="Georgia" ns0:hAnsi="Georgia" ns0:cs="Georgia"/>
-          <ns0:sz ns0:val="24"/>
-          <ns0:szCs ns0:val="24"/>
-        </ns0:rPr>
-        <ns0:t xml:space="preserve"/>
-      </ns0:r>
-    </ns0:p>
-    <ns0:p>
-      <ns0:pPr>
-        <ns0:spacing ns0:after="60" ns0:line="360"/>
+        <ns0:spacing ns0:after="60" ns0:line="360" ns0:before="480"/>
         <ns0:ind ns0:firstLine="360"/>
       </ns0:pPr>
       <ns0:r>
@@ -162,7 +149,7 @@
           <ns0:sz ns0:val="24"/>
           <ns0:szCs ns0:val="24"/>
         </ns0:rPr>
-        <ns0:t xml:space="preserve">The entity tasted what this child carried. Rejection. The mother's arms that had held him only once before they were pulled away. The father who had not spoken his name because no name had been given. The old woman's law that declared him a thing and not a person. It was all imprinted in the soft clay of an infant mind — a mark deeper than any ritual scar.</ns0:t>
+        <ns0:t xml:space="preserve">The entity tasted what this child carried. Rejection. The mother's arms that had held him only once before they were pulled away. The father who had not spoken his name because no name had been given. The old woman's law that declared him a thing and not a person. It was all imprinted in the soft clay of an infant mind. A mark deeper than any ritual scar.</ns0:t>
       </ns0:r>
     </ns0:p>
     <ns0:p>
@@ -195,29 +182,16 @@
     </ns0:p>
     <ns0:p>
       <ns0:pPr>
-        <ns0:spacing ns0:after="0" ns0:line="360"/>
-      </ns0:pPr>
-      <ns0:r>
-        <ns0:rPr>
-          <ns0:rFonts ns0:ascii="Georgia" ns0:hAnsi="Georgia" ns0:cs="Georgia"/>
-          <ns0:sz ns0:val="24"/>
-          <ns0:szCs ns0:val="24"/>
-        </ns0:rPr>
-        <ns0:t xml:space="preserve"/>
-      </ns0:r>
-    </ns0:p>
-    <ns0:p>
-      <ns0:pPr>
-        <ns0:spacing ns0:after="60" ns0:line="360"/>
-        <ns0:ind ns0:firstLine="360"/>
-      </ns0:pPr>
-      <ns0:r>
-        <ns0:rPr>
-          <ns0:rFonts ns0:ascii="Georgia" ns0:hAnsi="Georgia" ns0:cs="Georgia"/>
-          <ns0:sz ns0:val="24"/>
-          <ns0:szCs ns0:val="24"/>
-        </ns0:rPr>
-        <ns0:t xml:space="preserve">The bonding was not possession. Possession was crude — one will crushing another. This was fusion. The entity did not want to erase the child. It wanted to become the child, and it wanted the child to become something new. A vessel that could walk among the living. A vessel that could speak with a human tongue. A vessel that could be overlooked and underestimated until it was too late for overlooking to matter.</ns0:t>
+        <ns0:spacing ns0:after="60" ns0:line="360" ns0:before="480"/>
+        <ns0:ind ns0:firstLine="360"/>
+      </ns0:pPr>
+      <ns0:r>
+        <ns0:rPr>
+          <ns0:rFonts ns0:ascii="Georgia" ns0:hAnsi="Georgia" ns0:cs="Georgia"/>
+          <ns0:sz ns0:val="24"/>
+          <ns0:szCs ns0:val="24"/>
+        </ns0:rPr>
+        <ns0:t xml:space="preserve">The bonding was not possession. Possession was crude. One will crushing another. This was fusion. The entity did not want to erase the child. It wanted to become the child, and it wanted the child to become something new. A vessel that could walk among the living. A vessel that could speak with a human tongue. A vessel that could be overlooked and underestimated until it was too late for overlooking to matter.</ns0:t>
       </ns0:r>
     </ns0:p>
     <ns0:p>
@@ -245,7 +219,7 @@
           <ns0:sz ns0:val="24"/>
           <ns0:szCs ns0:val="24"/>
         </ns0:rPr>
-        <ns0:t xml:space="preserve">The hunger was not for food. It was for recognition. For the taste of worship that had once been its due before men learned to fear it. The old compact had fed it on the abandoned — dozens of infants over the decades, their small lives like drops of water on parched stone. Enough to keep it from fading. Not enough to let it rise.</ns0:t>
+        <ns0:t xml:space="preserve">The hunger was not for food. It was for recognition. For the taste of worship that had once been its due before men learned to fear it. The old compact had fed it on the abandoned. Dozens of infants over the decades, their small lives like drops of water on parched stone. Enough to keep it from fading. Not enough to let it rise.</ns0:t>
       </ns0:r>
     </ns0:p>
     <ns0:p>
@@ -273,20 +247,21 @@
           <ns0:sz ns0:val="24"/>
           <ns0:szCs ns0:val="24"/>
         </ns0:rPr>
-        <ns0:t xml:space="preserve">The entity fed on that. Not on the child's life. On the rejection that had delivered him here. On the law that wrapped him in ash marked cloth and laid him on cold ground. On the mother's screams and the father's silence and the old woman's stone face. Every human cruelty was fuel — and there had been so much cruelty, over so many centuries, all of it soaked into the soil of Oso. Now that fuel had a purpose.</ns0:t>
-      </ns0:r>
-    </ns0:p>
-    <ns0:p>
-      <ns0:pPr>
-        <ns0:spacing ns0:after="0" ns0:line="360"/>
-      </ns0:pPr>
-      <ns0:r>
-        <ns0:rPr>
-          <ns0:rFonts ns0:ascii="Georgia" ns0:hAnsi="Georgia" ns0:cs="Georgia"/>
-          <ns0:sz ns0:val="24"/>
-          <ns0:szCs ns0:val="24"/>
-        </ns0:rPr>
-        <ns0:t xml:space="preserve"/>
+        <ns0:t xml:space="preserve">The entity fed on that. Not on the child's life. On the rejection that had delivered him here. On the law that wrapped him in ash marked cloth and laid him on cold ground. On the mother's screams and the father's silence and the old woman's stone face. Every human cruelty was fuel, and there had been so much cruelty, over so many centuries, all of it soaked into the soil of Oso. Now that fuel had a purpose.</ns0:t>
+      </ns0:r>
+    </ns0:p>
+    <ns0:p>
+      <ns0:pPr>
+        <ns0:spacing ns0:after="60" ns0:line="360" ns0:before="480"/>
+        <ns0:ind ns0:firstLine="360"/>
+      </ns0:pPr>
+      <ns0:r>
+        <ns0:rPr>
+          <ns0:rFonts ns0:ascii="Georgia" ns0:hAnsi="Georgia" ns0:cs="Georgia"/>
+          <ns0:sz ns0:val="24"/>
+          <ns0:szCs ns0:val="24"/>
+        </ns0:rPr>
+        <ns0:t xml:space="preserve">And in the dark beneath the roots, the flat cold voice of the compact spoke, counting what it owned.</ns0:t>
       </ns0:r>
     </ns0:p>
     <ns0:p>
@@ -302,7 +277,7 @@
           <ns0:bCs/>
           <ns0:caps/>
         </ns0:rPr>
-        <ns0:t xml:space="preserve">CONDITION: BONDING — THE VESSEL AND THE ANCIENT ARE BECOMING ONE.</ns0:t>
+        <ns0:t xml:space="preserve">Condition: bonding. The vessel and the ancient are becoming one.</ns0:t>
       </ns0:r>
     </ns0:p>
     <ns0:p>
@@ -318,34 +293,21 @@
           <ns0:bCs/>
           <ns0:caps/>
         </ns0:rPr>
-        <ns0:t xml:space="preserve">HOST STATUS: MARKED — THE SECOND TWIN OF IDORO — TRANSFORMATION INITIATED.</ns0:t>
-      </ns0:r>
-    </ns0:p>
-    <ns0:p>
-      <ns0:pPr>
-        <ns0:spacing ns0:after="0" ns0:line="360"/>
-      </ns0:pPr>
-      <ns0:r>
-        <ns0:rPr>
-          <ns0:rFonts ns0:ascii="Georgia" ns0:hAnsi="Georgia" ns0:cs="Georgia"/>
-          <ns0:sz ns0:val="24"/>
-          <ns0:szCs ns0:val="24"/>
-        </ns0:rPr>
-        <ns0:t xml:space="preserve"/>
-      </ns0:r>
-    </ns0:p>
-    <ns0:p>
-      <ns0:pPr>
-        <ns0:spacing ns0:after="60" ns0:line="360"/>
-        <ns0:ind ns0:firstLine="360"/>
-      </ns0:pPr>
-      <ns0:r>
-        <ns0:rPr>
-          <ns0:rFonts ns0:ascii="Georgia" ns0:hAnsi="Georgia" ns0:cs="Georgia"/>
-          <ns0:sz ns0:val="24"/>
-          <ns0:szCs ns0:val="24"/>
-        </ns0:rPr>
-        <ns0:t xml:space="preserve">Dawn came to Idoro. The village woke to roosters crowing, women calling across compound walls, children laughing — children who had not been taken to Oso, children born alone and safe and blessed.</ns0:t>
+        <ns0:t xml:space="preserve">Host status: marked. The second twin of Idoro. Transformation initiated.</ns0:t>
+      </ns0:r>
+    </ns0:p>
+    <ns0:p>
+      <ns0:pPr>
+        <ns0:spacing ns0:after="60" ns0:line="360" ns0:before="480"/>
+        <ns0:ind ns0:firstLine="360"/>
+      </ns0:pPr>
+      <ns0:r>
+        <ns0:rPr>
+          <ns0:rFonts ns0:ascii="Georgia" ns0:hAnsi="Georgia" ns0:cs="Georgia"/>
+          <ns0:sz ns0:val="24"/>
+          <ns0:szCs ns0:val="24"/>
+        </ns0:rPr>
+        <ns0:t xml:space="preserve">Dawn came to Idoro. The village woke to roosters crowing, women calling across compound walls, children laughing. Children who had not been taken to Oso, children born alone and safe and blessed.</ns0:t>
       </ns0:r>
     </ns0:p>
     <ns0:p>
@@ -373,7 +335,7 @@
           <ns0:sz ns0:val="24"/>
           <ns0:szCs ns0:val="24"/>
         </ns0:rPr>
-        <ns0:t xml:space="preserve">Kene wailed for milk and Amara gave it. Her body moved through the motions. Her arms held him. Her breast fed him. But her eyes were somewhere else — on the empty space beside her on the sleeping mat, the space where the second bundle should have been. Her arms ached for the weight that was not there. Her chest knew there should be two mouths to feed.</ns0:t>
+        <ns0:t xml:space="preserve">Kene wailed for milk and Amara gave it. Her body moved through the motions. Her arms held him. Her breast fed him. But her eyes were somewhere else. They stayed on the empty space beside her on the sleeping mat, the space where the second bundle should have been. Her arms ached for the weight that was not there. Her chest knew there should be two mouths to feed.</ns0:t>
       </ns0:r>
     </ns0:p>
     <ns0:p>
@@ -392,20 +354,7 @@
     </ns0:p>
     <ns0:p>
       <ns0:pPr>
-        <ns0:spacing ns0:after="0" ns0:line="360"/>
-      </ns0:pPr>
-      <ns0:r>
-        <ns0:rPr>
-          <ns0:rFonts ns0:ascii="Georgia" ns0:hAnsi="Georgia" ns0:cs="Georgia"/>
-          <ns0:sz ns0:val="24"/>
-          <ns0:szCs ns0:val="24"/>
-        </ns0:rPr>
-        <ns0:t xml:space="preserve"/>
-      </ns0:r>
-    </ns0:p>
-    <ns0:p>
-      <ns0:pPr>
-        <ns0:spacing ns0:after="60" ns0:line="360"/>
+        <ns0:spacing ns0:after="60" ns0:line="360" ns0:before="480"/>
         <ns0:ind ns0:firstLine="360"/>
       </ns0:pPr>
       <ns0:r>
@@ -447,20 +396,7 @@
     </ns0:p>
     <ns0:p>
       <ns0:pPr>
-        <ns0:spacing ns0:after="0" ns0:line="360"/>
-      </ns0:pPr>
-      <ns0:r>
-        <ns0:rPr>
-          <ns0:rFonts ns0:ascii="Georgia" ns0:hAnsi="Georgia" ns0:cs="Georgia"/>
-          <ns0:sz ns0:val="24"/>
-          <ns0:szCs ns0:val="24"/>
-        </ns0:rPr>
-        <ns0:t xml:space="preserve"/>
-      </ns0:r>
-    </ns0:p>
-    <ns0:p>
-      <ns0:pPr>
-        <ns0:spacing ns0:after="60" ns0:line="360"/>
+        <ns0:spacing ns0:after="60" ns0:line="360" ns0:before="480"/>
         <ns0:ind ns0:firstLine="360"/>
       </ns0:pPr>
       <ns0:r>
@@ -483,7 +419,7 @@
           <ns0:sz ns0:val="24"/>
           <ns0:szCs ns0:val="24"/>
         </ns0:rPr>
-        <ns0:t xml:space="preserve">"The child is gone?"</ns0:t>
+        <ns0:t xml:space="preserve">"The child is gone?" Elder Maka asked. She already knew the answer.</ns0:t>
       </ns0:r>
     </ns0:p>
     <ns0:p>
@@ -511,7 +447,7 @@
           <ns0:sz ns0:val="24"/>
           <ns0:szCs ns0:val="24"/>
         </ns0:rPr>
-        <ns0:t xml:space="preserve">"Good. The law has been served. You will nurse the firstborn and forget the second. The abiku was never yours. It was a test sent by the spirits. You have passed. You will be blessed."</ns0:t>
+        <ns0:t xml:space="preserve">"Good," Elder Maka said, in the tone of a judge closing a case. "The law has been served. You will nurse the firstborn and forget the second. The abiku was never yours. It was a test sent by the spirits. You have passed. You will be blessed."</ns0:t>
       </ns0:r>
     </ns0:p>
     <ns0:p>
@@ -558,29 +494,16 @@
     </ns0:p>
     <ns0:p>
       <ns0:pPr>
-        <ns0:spacing ns0:after="0" ns0:line="360"/>
-      </ns0:pPr>
-      <ns0:r>
-        <ns0:rPr>
-          <ns0:rFonts ns0:ascii="Georgia" ns0:hAnsi="Georgia" ns0:cs="Georgia"/>
-          <ns0:sz ns0:val="24"/>
-          <ns0:szCs ns0:val="24"/>
-        </ns0:rPr>
-        <ns0:t xml:space="preserve"/>
-      </ns0:r>
-    </ns0:p>
-    <ns0:p>
-      <ns0:pPr>
-        <ns0:spacing ns0:after="60" ns0:line="360"/>
-        <ns0:ind ns0:firstLine="360"/>
-      </ns0:pPr>
-      <ns0:r>
-        <ns0:rPr>
-          <ns0:rFonts ns0:ascii="Georgia" ns0:hAnsi="Georgia" ns0:cs="Georgia"/>
-          <ns0:sz ns0:val="24"/>
-          <ns0:szCs ns0:val="24"/>
-        </ns0:rPr>
-        <ns0:t xml:space="preserve">Three compounds away, the dibia had not left his hut since returning from Oso. His apprentices heard him through the raffia door — the click of cowrie shells, the rattle of bone and charm, the murmur of words in a language older than any human tongue still spoken aloud.</ns0:t>
+        <ns0:spacing ns0:after="60" ns0:line="360" ns0:before="480"/>
+        <ns0:ind ns0:firstLine="360"/>
+      </ns0:pPr>
+      <ns0:r>
+        <ns0:rPr>
+          <ns0:rFonts ns0:ascii="Georgia" ns0:hAnsi="Georgia" ns0:cs="Georgia"/>
+          <ns0:sz ns0:val="24"/>
+          <ns0:szCs ns0:val="24"/>
+        </ns0:rPr>
+        <ns0:t xml:space="preserve">Three compounds away, the dibia had not left his hut since returning from Oso. His apprentices heard him through the raffia door. The click of cowrie shells, the rattle of bone and charm, the murmur of words in a language older than any human tongue still spoken aloud.</ns0:t>
       </ns0:r>
     </ns0:p>
     <ns0:p>
@@ -613,43 +536,30 @@
     </ns0:p>
     <ns0:p>
       <ns0:pPr>
-        <ns0:spacing ns0:after="0" ns0:line="360"/>
-      </ns0:pPr>
-      <ns0:r>
-        <ns0:rPr>
-          <ns0:rFonts ns0:ascii="Georgia" ns0:hAnsi="Georgia" ns0:cs="Georgia"/>
-          <ns0:sz ns0:val="24"/>
-          <ns0:szCs ns0:val="24"/>
-        </ns0:rPr>
-        <ns0:t xml:space="preserve"/>
-      </ns0:r>
-    </ns0:p>
-    <ns0:p>
-      <ns0:pPr>
-        <ns0:spacing ns0:after="60" ns0:line="360"/>
-        <ns0:ind ns0:firstLine="360"/>
-      </ns0:pPr>
-      <ns0:r>
-        <ns0:rPr>
-          <ns0:rFonts ns0:ascii="Georgia" ns0:hAnsi="Georgia" ns0:cs="Georgia"/>
-          <ns0:sz ns0:val="24"/>
-          <ns0:szCs ns0:val="24"/>
-        </ns0:rPr>
-        <ns0:t xml:space="preserve">He looked at the bowl. His blood had not spread into shapes the way blood divination required. It had formed a perfect sphere — a ball of darkness suspended in the clear water. It did not move. It did not dissolve. The dibia had delivered three hundred children. He had walked to the edge of Oso more times than he could count. He had never been afraid like this.</ns0:t>
-      </ns0:r>
-    </ns0:p>
-    <ns0:p>
-      <ns0:pPr>
-        <ns0:spacing ns0:after="60" ns0:line="360"/>
-        <ns0:ind ns0:firstLine="360"/>
-      </ns0:pPr>
-      <ns0:r>
-        <ns0:rPr>
-          <ns0:rFonts ns0:ascii="Georgia" ns0:hAnsi="Georgia" ns0:cs="Georgia"/>
-          <ns0:sz ns0:val="24"/>
-          <ns0:szCs ns0:val="24"/>
-        </ns0:rPr>
-        <ns0:t xml:space="preserve">Because he understood now. The secondborn was not an abiku. An abiku was small — a spirit child that tormented a single bloodline, something that could be warded and appeased. What he had carried to Oso was not small. Something ancient and patient and vast had been waiting beneath the roots of the twisted trees. And he had delivered a vessel straight into its waiting mouth.</ns0:t>
+        <ns0:spacing ns0:after="60" ns0:line="360" ns0:before="480"/>
+        <ns0:ind ns0:firstLine="360"/>
+      </ns0:pPr>
+      <ns0:r>
+        <ns0:rPr>
+          <ns0:rFonts ns0:ascii="Georgia" ns0:hAnsi="Georgia" ns0:cs="Georgia"/>
+          <ns0:sz ns0:val="24"/>
+          <ns0:szCs ns0:val="24"/>
+        </ns0:rPr>
+        <ns0:t xml:space="preserve">He looked at the bowl. His blood had not spread into shapes the way blood divination required. It had formed a perfect sphere. A ball of darkness suspended in the clear water. It did not move. It did not dissolve. The dibia had delivered three hundred children. He had walked to the edge of Oso more times than he could count. He had never been afraid like this.</ns0:t>
+      </ns0:r>
+    </ns0:p>
+    <ns0:p>
+      <ns0:pPr>
+        <ns0:spacing ns0:after="60" ns0:line="360"/>
+        <ns0:ind ns0:firstLine="360"/>
+      </ns0:pPr>
+      <ns0:r>
+        <ns0:rPr>
+          <ns0:rFonts ns0:ascii="Georgia" ns0:hAnsi="Georgia" ns0:cs="Georgia"/>
+          <ns0:sz ns0:val="24"/>
+          <ns0:szCs ns0:val="24"/>
+        </ns0:rPr>
+        <ns0:t xml:space="preserve">Because he understood now. The secondborn was not an abiku. An abiku was small. A spirit child that tormented a single bloodline, something that could be warded and appeased. What he had carried to Oso was not small. Something ancient and patient and vast had been waiting beneath the roots of the twisted trees. And he had delivered a vessel straight into its waiting mouth.</ns0:t>
       </ns0:r>
     </ns0:p>
     <ns0:p>
@@ -668,20 +578,7 @@
     </ns0:p>
     <ns0:p>
       <ns0:pPr>
-        <ns0:spacing ns0:after="0" ns0:line="360"/>
-      </ns0:pPr>
-      <ns0:r>
-        <ns0:rPr>
-          <ns0:rFonts ns0:ascii="Georgia" ns0:hAnsi="Georgia" ns0:cs="Georgia"/>
-          <ns0:sz ns0:val="24"/>
-          <ns0:szCs ns0:val="24"/>
-        </ns0:rPr>
-        <ns0:t xml:space="preserve"/>
-      </ns0:r>
-    </ns0:p>
-    <ns0:p>
-      <ns0:pPr>
-        <ns0:spacing ns0:after="60" ns0:line="360"/>
+        <ns0:spacing ns0:after="60" ns0:line="360" ns0:before="480"/>
         <ns0:ind ns0:firstLine="360"/>
       </ns0:pPr>
       <ns0:r>
@@ -704,39 +601,26 @@
           <ns0:sz ns0:val="24"/>
           <ns0:szCs ns0:val="24"/>
         </ns0:rPr>
-        <ns0:t xml:space="preserve">The child was warm. The cold of the night had not touched him. The ground around the iroko tree was warmer than the ground three feet away. The roots had shifted in the night — just enough to cradle the bundle. The tree knew what slept beneath it. The tree knew what had woken.</ns0:t>
-      </ns0:r>
-    </ns0:p>
-    <ns0:p>
-      <ns0:pPr>
-        <ns0:spacing ns0:after="60" ns0:line="360"/>
-        <ns0:ind ns0:firstLine="360"/>
-      </ns0:pPr>
-      <ns0:r>
-        <ns0:rPr>
-          <ns0:rFonts ns0:ascii="Georgia" ns0:hAnsi="Georgia" ns0:cs="Georgia"/>
-          <ns0:sz ns0:val="24"/>
-          <ns0:szCs ns0:val="24"/>
-        </ns0:rPr>
-        <ns0:t xml:space="preserve">The infant opened its eyes. The irises had darkened. The whites had cleared. There was a depth in them that no infant should possess — a depth that said someone was looking out, someone who understood what looking meant. The entity was learning to see through human eyes, and it found the world intoxicating.</ns0:t>
-      </ns0:r>
-    </ns0:p>
-    <ns0:p>
-      <ns0:pPr>
-        <ns0:spacing ns0:after="0" ns0:line="360"/>
-      </ns0:pPr>
-      <ns0:r>
-        <ns0:rPr>
-          <ns0:rFonts ns0:ascii="Georgia" ns0:hAnsi="Georgia" ns0:cs="Georgia"/>
-          <ns0:sz ns0:val="24"/>
-          <ns0:szCs ns0:val="24"/>
-        </ns0:rPr>
-        <ns0:t xml:space="preserve"/>
-      </ns0:r>
-    </ns0:p>
-    <ns0:p>
-      <ns0:pPr>
-        <ns0:spacing ns0:after="60" ns0:line="360"/>
+        <ns0:t xml:space="preserve">The child was warm. The cold of the night had not touched him. The ground around the iroko tree was warmer than the ground three feet away. The roots had shifted in the night, just enough to cradle the bundle. The tree knew what slept beneath it. The tree knew what had woken.</ns0:t>
+      </ns0:r>
+    </ns0:p>
+    <ns0:p>
+      <ns0:pPr>
+        <ns0:spacing ns0:after="60" ns0:line="360"/>
+        <ns0:ind ns0:firstLine="360"/>
+      </ns0:pPr>
+      <ns0:r>
+        <ns0:rPr>
+          <ns0:rFonts ns0:ascii="Georgia" ns0:hAnsi="Georgia" ns0:cs="Georgia"/>
+          <ns0:sz ns0:val="24"/>
+          <ns0:szCs ns0:val="24"/>
+        </ns0:rPr>
+        <ns0:t xml:space="preserve">The infant opened its eyes. The irises had darkened. The whites had cleared. There was a depth in them that no infant should possess. A depth that said someone was looking out, someone who understood what looking meant. The entity was learning to see through human eyes, and it found the world intoxicating.</ns0:t>
+      </ns0:r>
+    </ns0:p>
+    <ns0:p>
+      <ns0:pPr>
+        <ns0:spacing ns0:after="60" ns0:line="360" ns0:before="480"/>
         <ns0:ind ns0:firstLine="360"/>
       </ns0:pPr>
       <ns0:r>
@@ -759,7 +643,7 @@
           <ns0:sz ns0:val="24"/>
           <ns0:szCs ns0:val="24"/>
         </ns0:rPr>
-        <ns0:t xml:space="preserve">The tree shuddered. A tremor ran from root to branch. Green leaves fell — healthy leaves that should not have fallen, pushed from their branches by something that was testing what a human body could channel. Not much. Not yet. The infant form was fragile. The entity had to grow the vessel slowly, let the child's body strengthen, let the child's mind expand to hold what was being poured into it.</ns0:t>
+        <ns0:t xml:space="preserve">The tree shuddered. A tremor ran from root to branch. Green leaves fell. Healthy leaves that should not have fallen, pushed from their branches by something that was testing what a human body could channel. Not much. Not yet. The infant form was fragile. The entity had to grow the vessel slowly, let the child's body strengthen, let the child's mind expand to hold what was being poured into it.</ns0:t>
       </ns0:r>
     </ns0:p>
     <ns0:p>
@@ -778,15 +662,16 @@
     </ns0:p>
     <ns0:p>
       <ns0:pPr>
-        <ns0:spacing ns0:after="0" ns0:line="360"/>
-      </ns0:pPr>
-      <ns0:r>
-        <ns0:rPr>
-          <ns0:rFonts ns0:ascii="Georgia" ns0:hAnsi="Georgia" ns0:cs="Georgia"/>
-          <ns0:sz ns0:val="24"/>
-          <ns0:szCs ns0:val="24"/>
-        </ns0:rPr>
-        <ns0:t xml:space="preserve"/>
+        <ns0:spacing ns0:after="60" ns0:line="360" ns0:before="480"/>
+        <ns0:ind ns0:firstLine="360"/>
+      </ns0:pPr>
+      <ns0:r>
+        <ns0:rPr>
+          <ns0:rFonts ns0:ascii="Georgia" ns0:hAnsi="Georgia" ns0:cs="Georgia"/>
+          <ns0:sz ns0:val="24"/>
+          <ns0:szCs ns0:val="24"/>
+        </ns0:rPr>
+        <ns0:t xml:space="preserve">The voice that was not a voice spoke again, cold and exact.</ns0:t>
       </ns0:r>
     </ns0:p>
     <ns0:p>
@@ -802,7 +687,7 @@
           <ns0:bCs/>
           <ns0:caps/>
         </ns0:rPr>
-        <ns0:t xml:space="preserve">CONDITION: BONDED — THE FIRST THRESHOLD IS CROSSED.</ns0:t>
+        <ns0:t xml:space="preserve">Condition: bonded. The first threshold is crossed.</ns0:t>
       </ns0:r>
     </ns0:p>
     <ns0:p>
@@ -818,34 +703,21 @@
           <ns0:bCs/>
           <ns0:caps/>
         </ns0:rPr>
-        <ns0:t xml:space="preserve">VESSEL STATUS: AWAKENING — THE CHILD BEGINS TO MOVE WITH PURPOSE.</ns0:t>
-      </ns0:r>
-    </ns0:p>
-    <ns0:p>
-      <ns0:pPr>
-        <ns0:spacing ns0:after="0" ns0:line="360"/>
-      </ns0:pPr>
-      <ns0:r>
-        <ns0:rPr>
-          <ns0:rFonts ns0:ascii="Georgia" ns0:hAnsi="Georgia" ns0:cs="Georgia"/>
-          <ns0:sz ns0:val="24"/>
-          <ns0:szCs ns0:val="24"/>
-        </ns0:rPr>
-        <ns0:t xml:space="preserve"/>
-      </ns0:r>
-    </ns0:p>
-    <ns0:p>
-      <ns0:pPr>
-        <ns0:spacing ns0:after="60" ns0:line="360"/>
-        <ns0:ind ns0:firstLine="360"/>
-      </ns0:pPr>
-      <ns0:r>
-        <ns0:rPr>
-          <ns0:rFonts ns0:ascii="Georgia" ns0:hAnsi="Georgia" ns0:cs="Georgia"/>
-          <ns0:sz ns0:val="24"/>
-          <ns0:szCs ns0:val="24"/>
-        </ns0:rPr>
-        <ns0:t xml:space="preserve">The child made a sound. Not a cry. Not a hum. Something between. A sound a newborn should not have the breath to produce — a sound that held a tone beneath the tone, like two voices learning to speak as one.</ns0:t>
+        <ns0:t xml:space="preserve">Vessel status: awakening. The child begins to move with purpose.</ns0:t>
+      </ns0:r>
+    </ns0:p>
+    <ns0:p>
+      <ns0:pPr>
+        <ns0:spacing ns0:after="60" ns0:line="360" ns0:before="480"/>
+        <ns0:ind ns0:firstLine="360"/>
+      </ns0:pPr>
+      <ns0:r>
+        <ns0:rPr>
+          <ns0:rFonts ns0:ascii="Georgia" ns0:hAnsi="Georgia" ns0:cs="Georgia"/>
+          <ns0:sz ns0:val="24"/>
+          <ns0:szCs ns0:val="24"/>
+        </ns0:rPr>
+        <ns0:t xml:space="preserve">The child made a sound. Not a cry. Not a hum. Something between. A sound a newborn should not have the breath to produce. A sound that held a tone beneath the tone, like two voices learning to speak as one.</ns0:t>
       </ns0:r>
     </ns0:p>
     <ns0:p>
@@ -873,39 +745,12 @@
           <ns0:sz ns0:val="24"/>
           <ns0:szCs ns0:val="24"/>
         </ns0:rPr>
-        <ns0:t xml:space="preserve">The boundary held.</ns0:t>
-      </ns0:r>
-    </ns0:p>
-    <ns0:p>
-      <ns0:pPr>
-        <ns0:spacing ns0:after="60" ns0:line="360"/>
-        <ns0:ind ns0:firstLine="360"/>
-      </ns0:pPr>
-      <ns0:r>
-        <ns0:rPr>
-          <ns0:rFonts ns0:ascii="Georgia" ns0:hAnsi="Georgia" ns0:cs="Georgia"/>
-          <ns0:sz ns0:val="24"/>
-          <ns0:szCs ns0:val="24"/>
-        </ns0:rPr>
-        <ns0:t xml:space="preserve">It would not hold forever.</ns0:t>
-      </ns0:r>
-    </ns0:p>
-    <ns0:p>
-      <ns0:pPr>
-        <ns0:spacing ns0:after="0" ns0:line="360"/>
-      </ns0:pPr>
-      <ns0:r>
-        <ns0:rPr>
-          <ns0:rFonts ns0:ascii="Georgia" ns0:hAnsi="Georgia" ns0:cs="Georgia"/>
-          <ns0:sz ns0:val="24"/>
-          <ns0:szCs ns0:val="24"/>
-        </ns0:rPr>
-        <ns0:t xml:space="preserve"/>
-      </ns0:r>
-    </ns0:p>
-    <ns0:p>
-      <ns0:pPr>
-        <ns0:spacing ns0:after="60" ns0:line="360"/>
+        <ns0:t xml:space="preserve">The boundary held. It would not hold forever.</ns0:t>
+      </ns0:r>
+    </ns0:p>
+    <ns0:p>
+      <ns0:pPr>
+        <ns0:spacing ns0:after="60" ns0:line="360" ns0:before="480"/>
         <ns0:ind ns0:firstLine="360"/>
       </ns0:pPr>
       <ns0:r>
@@ -928,21 +773,21 @@
           <ns0:sz ns0:val="24"/>
           <ns0:szCs ns0:val="24"/>
         </ns0:rPr>
-        <ns0:t xml:space="preserve">"Master? What has happened?"</ns0:t>
-      </ns0:r>
-    </ns0:p>
-    <ns0:p>
-      <ns0:pPr>
-        <ns0:spacing ns0:after="60" ns0:line="360"/>
-        <ns0:ind ns0:firstLine="360"/>
-      </ns0:pPr>
-      <ns0:r>
-        <ns0:rPr>
-          <ns0:rFonts ns0:ascii="Georgia" ns0:hAnsi="Georgia" ns0:cs="Georgia"/>
-          <ns0:sz ns0:val="24"/>
-          <ns0:szCs ns0:val="24"/>
-        </ns0:rPr>
-        <ns0:t xml:space="preserve">The dibia opened his mouth. He had to warn them. He had to tell Elder Maka. He had to undo what he had done — impossible, you could not unfeed a hunger that had starved for three hundred years — but he had to try.</ns0:t>
+        <ns0:t xml:space="preserve">"Master? What has happened?" the eldest apprentice asked, his voice gone small.</ns0:t>
+      </ns0:r>
+    </ns0:p>
+    <ns0:p>
+      <ns0:pPr>
+        <ns0:spacing ns0:after="60" ns0:line="360"/>
+        <ns0:ind ns0:firstLine="360"/>
+      </ns0:pPr>
+      <ns0:r>
+        <ns0:rPr>
+          <ns0:rFonts ns0:ascii="Georgia" ns0:hAnsi="Georgia" ns0:cs="Georgia"/>
+          <ns0:sz ns0:val="24"/>
+          <ns0:szCs ns0:val="24"/>
+        </ns0:rPr>
+        <ns0:t xml:space="preserve">The dibia opened his mouth. He had to warn them. He had to tell Elder Maka. He had to undo what he had done. Impossible. You could not unfeed a hunger that had starved for three hundred years. But he had to try.</ns0:t>
       </ns0:r>
     </ns0:p>
     <ns0:p>
@@ -970,7 +815,7 @@
           <ns0:sz ns0:val="24"/>
           <ns0:szCs ns0:val="24"/>
         </ns0:rPr>
-        <ns0:t xml:space="preserve">His mouth moved. His throat worked. The words were there. They would not come out. Something was stopping him. Something wanted the village to go on with its ordinary day — children playing, women cooking, men fishing — while a power older than the kingdom grew stronger three miles from their walls.</ns0:t>
+        <ns0:t xml:space="preserve">His mouth moved. His throat worked. The words were there. They would not come out. Something was stopping him. Something wanted the village to go on with its ordinary day. Children playing, women cooking, men fishing, while a power older than the kingdom grew stronger three miles from their walls.</ns0:t>
       </ns0:r>
     </ns0:p>
     <ns0:p>
@@ -1027,19 +872,6 @@
           <ns0:szCs ns0:val="24"/>
         </ns0:rPr>
         <ns0:t xml:space="preserve">It said: I am coming.</ns0:t>
-      </ns0:r>
-    </ns0:p>
-    <ns0:p>
-      <ns0:pPr>
-        <ns0:spacing ns0:after="0" ns0:line="360"/>
-      </ns0:pPr>
-      <ns0:r>
-        <ns0:rPr>
-          <ns0:rFonts ns0:ascii="Georgia" ns0:hAnsi="Georgia" ns0:cs="Georgia"/>
-          <ns0:sz ns0:val="24"/>
-          <ns0:szCs ns0:val="24"/>
-        </ns0:rPr>
-        <ns0:t xml:space="preserve"/>
       </ns0:r>
     </ns0:p>
     <ns0:sectPr>

</xml_diff>